<commit_message>
Condense Textent case study and clarify resume
</commit_message>
<xml_diff>
--- a/assets/resume/Aravind_Anisetti_Data_AI_Solutions_Architect.docx
+++ b/assets/resume/Aravind_Anisetti_Data_AI_Solutions_Architect.docx
@@ -174,22 +174,6 @@
     </w:p>
     <w:p>
       <w:pPr>
-        <w:pStyle w:val="CompactBody"/>
-        <w:keepLines/>
-        <w:spacing w:before="20" w:after="60"/>
-      </w:pPr>
-      <w:r>
-        <w:rPr>
-          <w:rFonts w:ascii="Calibri" w:hAnsi="Calibri"/>
-          <w:b/>
-          <w:color w:val="2A527A"/>
-          <w:sz w:val="18"/>
-        </w:rPr>
-        <w:t>ENTERPRISE DELIVERY: FEDERAL AVIATION ADMINISTRATION (FAA)  |  CISCO  |  KAISER PERMANENTE</w:t>
-      </w:r>
-    </w:p>
-    <w:p>
-      <w:pPr>
         <w:pStyle w:val="SectionHeading"/>
         <w:keepNext/>
       </w:pPr>
@@ -258,7 +242,7 @@
           <w:color w:val="4E5968"/>
           <w:sz w:val="18"/>
         </w:rPr>
-        <w:t xml:space="preserve"> | Verified offline core | AWS target architecture | Enterprise direction</w:t>
+        <w:t xml:space="preserve"> | Private, pre-launch | Verified offline core | AWS target architecture</w:t>
       </w:r>
     </w:p>
     <w:p>
@@ -297,7 +281,7 @@
           <w:color w:val="161F2D"/>
           <w:sz w:val="19"/>
         </w:rPr>
-        <w:t>Defined three guided review paths - Reuse, Show What Changed, and Decision Check - that turn complex document work into a bounded human-attention queue with exact evidence, consequence, and a clear next action.</w:t>
+        <w:t>Defined three guided review paths - Reuse, Compare, and Decide - to reduce complex versioned-document review to material findings with exact evidence, business consequence, and a human-owned next action.</w:t>
       </w:r>
     </w:p>
     <w:p>
@@ -311,7 +295,7 @@
           <w:color w:val="161F2D"/>
           <w:sz w:val="19"/>
         </w:rPr>
-        <w:t>Implemented and verified the offline core for DOCX structural validation and main-body extraction, deterministic source-bound evidence anchors, input/token admission contracts, fail-closed future-model evidence validation, and immutable verification/idempotency contracts.</w:t>
+        <w:t>Implemented and verified an offline core for DOCX structure validation, main-body extraction, source-bound evidence anchors, admission limits, fail-closed evidence checks, and automated workflow verification.</w:t>
       </w:r>
     </w:p>
     <w:p>
@@ -325,21 +309,7 @@
           <w:color w:val="161F2D"/>
           <w:sz w:val="19"/>
         </w:rPr>
-        <w:t>Built an accessible React/TypeScript synthetic journey and protected-main verification; designed an event-driven AWS scale architecture using CloudFront, WAF, Cognito, API Gateway, S3, SQS/DLQ, Step Functions, Lambda, DynamoDB, CloudWatch, CDK, and a bounded Amazon Bedrock inference stage.</w:t>
-      </w:r>
-    </w:p>
-    <w:p>
-      <w:pPr>
-        <w:pStyle w:val="ResumeBullet"/>
-        <w:keepLines/>
-      </w:pPr>
-      <w:r>
-        <w:rPr>
-          <w:rFonts w:ascii="Calibri" w:hAnsi="Calibri"/>
-          <w:color w:val="161F2D"/>
-          <w:sz w:val="19"/>
-        </w:rPr>
-        <w:t>Separated deterministic processing, bounded model judgment, exact-evidence validation, and human approval; defined a conditional enterprise direction for permission-aware Microsoft 365/Slack connectors, structure-aware chunking, embeddings, hybrid retrieval/reranking, evidence-backed RAG, controlled generation, and audit workflows.</w:t>
+        <w:t>Designed an event-driven AWS target architecture using CloudFront, WAF, Cognito, API Gateway, S3, SQS/DLQ, Step Functions, Lambda, DynamoDB, CloudWatch, CDK, and bounded Amazon Bedrock inference, with identity, cost, observability, recovery, retention, and deletion controls.</w:t>
       </w:r>
     </w:p>
     <w:p>
@@ -508,16 +478,6 @@
       </w:r>
     </w:p>
     <w:p>
-      <w:r>
-        <w:rPr>
-          <w:rFonts w:ascii="Calibri" w:hAnsi="Calibri"/>
-          <w:color w:val="161F2D"/>
-          <w:sz w:val="19"/>
-        </w:rPr>
-        <w:br w:type="page"/>
-      </w:r>
-    </w:p>
-    <w:p>
       <w:pPr>
         <w:pStyle w:val="RoleHeading"/>
         <w:keepNext/>
@@ -606,7 +566,7 @@
           <w:color w:val="161F2D"/>
           <w:sz w:val="19"/>
         </w:rPr>
-        <w:t>Partnered with analysts to replace manual Excel-based processes with repeatable data pipelines and curated reporting outputs.</w:t>
+        <w:t>Automated recurring Excel-based analyst preparation by replacing manual steps with repeatable AWS data pipelines and curated reporting outputs.</w:t>
       </w:r>
     </w:p>
     <w:p>
@@ -621,6 +581,16 @@
           <w:sz w:val="19"/>
         </w:rPr>
         <w:t>Developed Glue/PySpark transformations and orchestrated multi-step workflows with Step Functions and Lambda to improve failure handling and operational visibility for AWS analytics pipelines.</w:t>
+      </w:r>
+    </w:p>
+    <w:p>
+      <w:r>
+        <w:rPr>
+          <w:rFonts w:ascii="Calibri" w:hAnsi="Calibri"/>
+          <w:color w:val="161F2D"/>
+          <w:sz w:val="19"/>
+        </w:rPr>
+        <w:br w:type="page"/>
       </w:r>
     </w:p>
     <w:p>

</xml_diff>

<commit_message>
Condense Textent case study and clarify resume (#3)
Co-authored-by: Aravind Anisetti <anisetti.ar@example.com>
</commit_message>
<xml_diff>
--- a/assets/resume/Aravind_Anisetti_Data_AI_Solutions_Architect.docx
+++ b/assets/resume/Aravind_Anisetti_Data_AI_Solutions_Architect.docx
@@ -174,22 +174,6 @@
     </w:p>
     <w:p>
       <w:pPr>
-        <w:pStyle w:val="CompactBody"/>
-        <w:keepLines/>
-        <w:spacing w:before="20" w:after="60"/>
-      </w:pPr>
-      <w:r>
-        <w:rPr>
-          <w:rFonts w:ascii="Calibri" w:hAnsi="Calibri"/>
-          <w:b/>
-          <w:color w:val="2A527A"/>
-          <w:sz w:val="18"/>
-        </w:rPr>
-        <w:t>ENTERPRISE DELIVERY: FEDERAL AVIATION ADMINISTRATION (FAA)  |  CISCO  |  KAISER PERMANENTE</w:t>
-      </w:r>
-    </w:p>
-    <w:p>
-      <w:pPr>
         <w:pStyle w:val="SectionHeading"/>
         <w:keepNext/>
       </w:pPr>
@@ -258,7 +242,7 @@
           <w:color w:val="4E5968"/>
           <w:sz w:val="18"/>
         </w:rPr>
-        <w:t xml:space="preserve"> | Verified offline core | AWS target architecture | Enterprise direction</w:t>
+        <w:t xml:space="preserve"> | Private, pre-launch | Verified offline core | AWS target architecture</w:t>
       </w:r>
     </w:p>
     <w:p>
@@ -297,7 +281,7 @@
           <w:color w:val="161F2D"/>
           <w:sz w:val="19"/>
         </w:rPr>
-        <w:t>Defined three guided review paths - Reuse, Show What Changed, and Decision Check - that turn complex document work into a bounded human-attention queue with exact evidence, consequence, and a clear next action.</w:t>
+        <w:t>Defined three guided review paths - Reuse, Compare, and Decide - to reduce complex versioned-document review to material findings with exact evidence, business consequence, and a human-owned next action.</w:t>
       </w:r>
     </w:p>
     <w:p>
@@ -311,7 +295,7 @@
           <w:color w:val="161F2D"/>
           <w:sz w:val="19"/>
         </w:rPr>
-        <w:t>Implemented and verified the offline core for DOCX structural validation and main-body extraction, deterministic source-bound evidence anchors, input/token admission contracts, fail-closed future-model evidence validation, and immutable verification/idempotency contracts.</w:t>
+        <w:t>Implemented and verified an offline core for DOCX structure validation, main-body extraction, source-bound evidence anchors, admission limits, fail-closed evidence checks, and automated workflow verification.</w:t>
       </w:r>
     </w:p>
     <w:p>
@@ -325,21 +309,7 @@
           <w:color w:val="161F2D"/>
           <w:sz w:val="19"/>
         </w:rPr>
-        <w:t>Built an accessible React/TypeScript synthetic journey and protected-main verification; designed an event-driven AWS scale architecture using CloudFront, WAF, Cognito, API Gateway, S3, SQS/DLQ, Step Functions, Lambda, DynamoDB, CloudWatch, CDK, and a bounded Amazon Bedrock inference stage.</w:t>
-      </w:r>
-    </w:p>
-    <w:p>
-      <w:pPr>
-        <w:pStyle w:val="ResumeBullet"/>
-        <w:keepLines/>
-      </w:pPr>
-      <w:r>
-        <w:rPr>
-          <w:rFonts w:ascii="Calibri" w:hAnsi="Calibri"/>
-          <w:color w:val="161F2D"/>
-          <w:sz w:val="19"/>
-        </w:rPr>
-        <w:t>Separated deterministic processing, bounded model judgment, exact-evidence validation, and human approval; defined a conditional enterprise direction for permission-aware Microsoft 365/Slack connectors, structure-aware chunking, embeddings, hybrid retrieval/reranking, evidence-backed RAG, controlled generation, and audit workflows.</w:t>
+        <w:t>Designed an event-driven AWS target architecture using CloudFront, WAF, Cognito, API Gateway, S3, SQS/DLQ, Step Functions, Lambda, DynamoDB, CloudWatch, CDK, and bounded Amazon Bedrock inference, with identity, cost, observability, recovery, retention, and deletion controls.</w:t>
       </w:r>
     </w:p>
     <w:p>
@@ -508,16 +478,6 @@
       </w:r>
     </w:p>
     <w:p>
-      <w:r>
-        <w:rPr>
-          <w:rFonts w:ascii="Calibri" w:hAnsi="Calibri"/>
-          <w:color w:val="161F2D"/>
-          <w:sz w:val="19"/>
-        </w:rPr>
-        <w:br w:type="page"/>
-      </w:r>
-    </w:p>
-    <w:p>
       <w:pPr>
         <w:pStyle w:val="RoleHeading"/>
         <w:keepNext/>
@@ -606,7 +566,7 @@
           <w:color w:val="161F2D"/>
           <w:sz w:val="19"/>
         </w:rPr>
-        <w:t>Partnered with analysts to replace manual Excel-based processes with repeatable data pipelines and curated reporting outputs.</w:t>
+        <w:t>Automated recurring Excel-based analyst preparation by replacing manual steps with repeatable AWS data pipelines and curated reporting outputs.</w:t>
       </w:r>
     </w:p>
     <w:p>
@@ -621,6 +581,16 @@
           <w:sz w:val="19"/>
         </w:rPr>
         <w:t>Developed Glue/PySpark transformations and orchestrated multi-step workflows with Step Functions and Lambda to improve failure handling and operational visibility for AWS analytics pipelines.</w:t>
+      </w:r>
+    </w:p>
+    <w:p>
+      <w:r>
+        <w:rPr>
+          <w:rFonts w:ascii="Calibri" w:hAnsi="Calibri"/>
+          <w:color w:val="161F2D"/>
+          <w:sz w:val="19"/>
+        </w:rPr>
+        <w:br w:type="page"/>
       </w:r>
     </w:p>
     <w:p>

</xml_diff>

<commit_message>
Refine Textent recruiter case study
</commit_message>
<xml_diff>
--- a/assets/resume/Aravind_Anisetti_Data_AI_Solutions_Architect.docx
+++ b/assets/resume/Aravind_Anisetti_Data_AI_Solutions_Architect.docx
@@ -169,7 +169,7 @@
           <w:color w:val="161F2D"/>
           <w:sz w:val="19"/>
         </w:rPr>
-        <w:t>Data Analytics Lead with 8+ years translating enterprise requirements into governed analytics, cloud data, automation, and applied-AI solutions across federal and commercial environments. AWS Certified Solutions Architect - Associate with experience spanning AWS, Redshift, Snowflake, SQL, Python, Power BI, RAG design, operational controls, and cross-functional solution delivery. Creator and Product Architect of Textent, a private GenAI product architecture for evidence-backed review of complex, versioned documents.</w:t>
+        <w:t>Data Analytics Lead with 8+ years of experience translating enterprise requirements into analytics, event-driven AWS data workflows, automation, and applied-AI solutions across federal and commercial environments. AWS Certified Solutions Architect - Associate with experience spanning AWS, Redshift, Snowflake, SQL, Python, Power BI, bounded RAG controls, operational reliability, and cross-functional solution delivery. Creator and Product Architect of Textent, a private GenAI product architecture for evidence-backed review of complex, versioned documents.</w:t>
       </w:r>
     </w:p>
     <w:p>
@@ -258,7 +258,7 @@
             <w:u w:val="none"/>
             <w:sz w:val="18"/>
           </w:rPr>
-          <w:t>aravind-bit.github.io/textent</w:t>
+          <w:t>Textent</w:t>
         </w:r>
       </w:hyperlink>
       <w:r>
@@ -267,7 +267,7 @@
           <w:color w:val="4E5968"/>
           <w:sz w:val="19"/>
         </w:rPr>
-        <w:t xml:space="preserve"> | Product narrative, AWS architecture, and decision trade-offs</w:t>
+        <w:t xml:space="preserve"> | Product case study, AWS architecture, and decision trade-offs</w:t>
       </w:r>
     </w:p>
     <w:p>
@@ -281,7 +281,7 @@
           <w:color w:val="161F2D"/>
           <w:sz w:val="19"/>
         </w:rPr>
-        <w:t>Defined three guided review paths - Reuse, Compare, and Decide - to reduce complex versioned-document review to material findings with exact evidence, business consequence, and a human-owned next action.</w:t>
+        <w:t>Defined Reuse, Compare, and Decide workflows to reduce manual review effort for analysts and business reviewers by turning complex versioned documents into material findings with exact evidence, business consequence, and a human-owned next action.</w:t>
       </w:r>
     </w:p>
     <w:p>
@@ -390,7 +390,7 @@
           <w:color w:val="4E5968"/>
           <w:sz w:val="18"/>
         </w:rPr>
-        <w:t xml:space="preserve"> | Karsun Solutions LLC - employer</w:t>
+        <w:t xml:space="preserve"> | Karsun Solutions LLC</w:t>
       </w:r>
     </w:p>
     <w:p>
@@ -446,7 +446,7 @@
           <w:color w:val="161F2D"/>
           <w:sz w:val="19"/>
         </w:rPr>
-        <w:t>Build and support AWS data workflows using S3, Glue, Lambda, Step Functions, Redshift, SQL, and Python, including transforming Microsoft Teams communications into structured analytics datasets.</w:t>
+        <w:t>Design and support event-driven AWS data workflows using S3, Glue, Lambda, Step Functions, Redshift, SQL, and Python, including transforming Microsoft Teams communications into structured analytics datasets for analysis and reporting.</w:t>
       </w:r>
     </w:p>
     <w:p>
@@ -474,7 +474,7 @@
           <w:color w:val="161F2D"/>
           <w:sz w:val="19"/>
         </w:rPr>
-        <w:t>Configure Power Automate notifications and support SQL connectors and retrieval-design discussions for an internal RAG chat using Azure OpenAI and Azure AI Search within enterprise security constraints.</w:t>
+        <w:t>Configure Power Automate notifications and support SQL connectors and retrieval-design discussions for a bounded internal RAG workflow using Azure OpenAI and Azure AI Search, with data, model endpoints, and logic retained inside enterprise security controls.</w:t>
       </w:r>
     </w:p>
     <w:p>
@@ -649,7 +649,7 @@
           <w:color w:val="4E5968"/>
           <w:sz w:val="18"/>
         </w:rPr>
-        <w:t xml:space="preserve"> | Kforce Consulting - employer</w:t>
+        <w:t xml:space="preserve"> | Kforce Consulting</w:t>
       </w:r>
     </w:p>
     <w:p>
@@ -829,7 +829,7 @@
           <w:color w:val="161F2D"/>
           <w:sz w:val="19"/>
         </w:rPr>
-        <w:t xml:space="preserve"> - Built a Python/OpenAI/Streamlit earnings-intelligence prototype with config-driven document ingestion, structured JSON insight packs, KPI extraction, AI summaries, and document-aware Q&amp;A over a limited set of sample earnings materials.</w:t>
+        <w:t xml:space="preserve"> - Built a Python/OpenAI/Streamlit prototype to help financial analysts move from sample earnings documents to structured KPIs, source-aware summaries, and document Q&amp;A through config-driven ingestion and JSON insight packs.</w:t>
       </w:r>
     </w:p>
     <w:p>
@@ -856,7 +856,7 @@
           <w:color w:val="161F2D"/>
           <w:sz w:val="19"/>
         </w:rPr>
-        <w:t xml:space="preserve"> - Created a media-merger strategy sandbox combining explainable rules, embeddings/FAISS, traceable sources, interactive buyer/target scenarios, IP-similarity views, and clearly labeled exploratory predictions.</w:t>
+        <w:t xml:space="preserve"> - Created a media-merger strategy sandbox to help strategy teams compare buyer/target scenarios using explainable rules, embeddings/FAISS, traceable sources, IP-similarity views, and clearly labeled exploratory predictions.</w:t>
       </w:r>
     </w:p>
     <w:p>
@@ -883,7 +883,7 @@
           <w:color w:val="161F2D"/>
           <w:sz w:val="19"/>
         </w:rPr>
-        <w:t xml:space="preserve"> - Developed a synthetic cross-media planning workflow spanning data generation, linear/XGBoost response modeling, reach-overlap simulation, constrained optimization, and explainability to compare conversion and reach trade-offs.</w:t>
+        <w:t xml:space="preserve"> - Developed a synthetic cross-media planning workflow to help planners compare conversion and reach trade-offs through data generation, linear/XGBoost response modeling, reach-overlap simulation, constrained optimization, and explainability.</w:t>
       </w:r>
     </w:p>
     <w:p>

</xml_diff>

<commit_message>
Add quantified resume outcomes
</commit_message>
<xml_diff>
--- a/assets/resume/Aravind_Anisetti_Data_AI_Solutions_Architect.docx
+++ b/assets/resume/Aravind_Anisetti_Data_AI_Solutions_Architect.docx
@@ -418,6 +418,34 @@
           <w:color w:val="161F2D"/>
           <w:sz w:val="19"/>
         </w:rPr>
+        <w:t>Built scalable Power BI monitoring and Power Automate alerts for an expanding mix of streaming and batch ETL workflows, reducing failure detection and triage from 1-3 days to within one hour.</w:t>
+      </w:r>
+    </w:p>
+    <w:p>
+      <w:pPr>
+        <w:pStyle w:val="ResumeBullet"/>
+        <w:keepLines/>
+      </w:pPr>
+      <w:r>
+        <w:rPr>
+          <w:rFonts w:ascii="Calibri" w:hAnsi="Calibri"/>
+          <w:color w:val="161F2D"/>
+          <w:sz w:val="19"/>
+        </w:rPr>
+        <w:t>Reduced a large historical-data ingestion from up to six hours to 30-60 minutes by partitioning source data, staging raw files in S3, and parallelizing StreamSets processing.</w:t>
+      </w:r>
+    </w:p>
+    <w:p>
+      <w:pPr>
+        <w:pStyle w:val="ResumeBullet"/>
+        <w:keepLines/>
+      </w:pPr>
+      <w:r>
+        <w:rPr>
+          <w:rFonts w:ascii="Calibri" w:hAnsi="Calibri"/>
+          <w:color w:val="161F2D"/>
+          <w:sz w:val="19"/>
+        </w:rPr>
         <w:t>Design Redshift/SQL data marts, reusable analytics models, Power BI reporting layers, metadata standards, and data-quality checks for consistent self-service reporting.</w:t>
       </w:r>
     </w:p>
@@ -432,7 +460,7 @@
           <w:color w:val="161F2D"/>
           <w:sz w:val="19"/>
         </w:rPr>
-        <w:t>Partner with product managers, engineering, operations, and program stakeholders to define KPIs, validate metric definitions, and align analytics delivery with business and compliance decisions.</w:t>
+        <w:t>Build AWS data workflows using S3, Glue, Lambda, Step Functions, Redshift, SQL, and Python, including transforming Microsoft Teams communications into structured analytics datasets for analysis and reporting.</w:t>
       </w:r>
     </w:p>
     <w:p>
@@ -446,21 +474,7 @@
           <w:color w:val="161F2D"/>
           <w:sz w:val="19"/>
         </w:rPr>
-        <w:t>Design and support event-driven AWS data workflows using S3, Glue, Lambda, Step Functions, Redshift, SQL, and Python, including transforming Microsoft Teams communications into structured analytics datasets for analysis and reporting.</w:t>
-      </w:r>
-    </w:p>
-    <w:p>
-      <w:pPr>
-        <w:pStyle w:val="ResumeBullet"/>
-        <w:keepLines/>
-      </w:pPr>
-      <w:r>
-        <w:rPr>
-          <w:rFonts w:ascii="Calibri" w:hAnsi="Calibri"/>
-          <w:color w:val="161F2D"/>
-          <w:sz w:val="19"/>
-        </w:rPr>
-        <w:t>Implement CloudWatch monitoring, alerting, validation, troubleshooting, and SQL/warehouse tuning to improve visibility and reliability for recurring analytics workflows and dashboards.</w:t>
+        <w:t>Built a Power Apps and Power Automate workflow that automated manual AD-group reviews with daily monitoring, exception flagging, change-history exports, and notifications, strengthening least-privilege governance.</w:t>
       </w:r>
     </w:p>
     <w:p>
@@ -691,7 +705,7 @@
           <w:color w:val="161F2D"/>
           <w:sz w:val="19"/>
         </w:rPr>
-        <w:t>Developed BI dashboards and KPI reporting solutions supporting incident analysis, campaign-performance tracking, and stakeholder decision-making.</w:t>
+        <w:t>Replaced multi-day email and Excel reporting with an automated Tableau system that tracked product-security work from approval through production, highlighted bottlenecks, and delivered threshold alerts for leadership planning.</w:t>
       </w:r>
     </w:p>
     <w:p>

</xml_diff>

<commit_message>
Refine Textent recruiter case study (#4)
* Refine Textent recruiter case study

* Add quantified resume outcomes

---------

Co-authored-by: Aravind Anisetti <anisetti.ar@example.com>
</commit_message>
<xml_diff>
--- a/assets/resume/Aravind_Anisetti_Data_AI_Solutions_Architect.docx
+++ b/assets/resume/Aravind_Anisetti_Data_AI_Solutions_Architect.docx
@@ -169,7 +169,7 @@
           <w:color w:val="161F2D"/>
           <w:sz w:val="19"/>
         </w:rPr>
-        <w:t>Data Analytics Lead with 8+ years translating enterprise requirements into governed analytics, cloud data, automation, and applied-AI solutions across federal and commercial environments. AWS Certified Solutions Architect - Associate with experience spanning AWS, Redshift, Snowflake, SQL, Python, Power BI, RAG design, operational controls, and cross-functional solution delivery. Creator and Product Architect of Textent, a private GenAI product architecture for evidence-backed review of complex, versioned documents.</w:t>
+        <w:t>Data Analytics Lead with 8+ years of experience translating enterprise requirements into analytics, event-driven AWS data workflows, automation, and applied-AI solutions across federal and commercial environments. AWS Certified Solutions Architect - Associate with experience spanning AWS, Redshift, Snowflake, SQL, Python, Power BI, bounded RAG controls, operational reliability, and cross-functional solution delivery. Creator and Product Architect of Textent, a private GenAI product architecture for evidence-backed review of complex, versioned documents.</w:t>
       </w:r>
     </w:p>
     <w:p>
@@ -258,7 +258,7 @@
             <w:u w:val="none"/>
             <w:sz w:val="18"/>
           </w:rPr>
-          <w:t>aravind-bit.github.io/textent</w:t>
+          <w:t>Textent</w:t>
         </w:r>
       </w:hyperlink>
       <w:r>
@@ -267,7 +267,7 @@
           <w:color w:val="4E5968"/>
           <w:sz w:val="19"/>
         </w:rPr>
-        <w:t xml:space="preserve"> | Product narrative, AWS architecture, and decision trade-offs</w:t>
+        <w:t xml:space="preserve"> | Product case study, AWS architecture, and decision trade-offs</w:t>
       </w:r>
     </w:p>
     <w:p>
@@ -281,7 +281,7 @@
           <w:color w:val="161F2D"/>
           <w:sz w:val="19"/>
         </w:rPr>
-        <w:t>Defined three guided review paths - Reuse, Compare, and Decide - to reduce complex versioned-document review to material findings with exact evidence, business consequence, and a human-owned next action.</w:t>
+        <w:t>Defined Reuse, Compare, and Decide workflows to reduce manual review effort for analysts and business reviewers by turning complex versioned documents into material findings with exact evidence, business consequence, and a human-owned next action.</w:t>
       </w:r>
     </w:p>
     <w:p>
@@ -390,7 +390,7 @@
           <w:color w:val="4E5968"/>
           <w:sz w:val="18"/>
         </w:rPr>
-        <w:t xml:space="preserve"> | Karsun Solutions LLC - employer</w:t>
+        <w:t xml:space="preserve"> | Karsun Solutions LLC</w:t>
       </w:r>
     </w:p>
     <w:p>
@@ -418,6 +418,34 @@
           <w:color w:val="161F2D"/>
           <w:sz w:val="19"/>
         </w:rPr>
+        <w:t>Built scalable Power BI monitoring and Power Automate alerts for an expanding mix of streaming and batch ETL workflows, reducing failure detection and triage from 1-3 days to within one hour.</w:t>
+      </w:r>
+    </w:p>
+    <w:p>
+      <w:pPr>
+        <w:pStyle w:val="ResumeBullet"/>
+        <w:keepLines/>
+      </w:pPr>
+      <w:r>
+        <w:rPr>
+          <w:rFonts w:ascii="Calibri" w:hAnsi="Calibri"/>
+          <w:color w:val="161F2D"/>
+          <w:sz w:val="19"/>
+        </w:rPr>
+        <w:t>Reduced a large historical-data ingestion from up to six hours to 30-60 minutes by partitioning source data, staging raw files in S3, and parallelizing StreamSets processing.</w:t>
+      </w:r>
+    </w:p>
+    <w:p>
+      <w:pPr>
+        <w:pStyle w:val="ResumeBullet"/>
+        <w:keepLines/>
+      </w:pPr>
+      <w:r>
+        <w:rPr>
+          <w:rFonts w:ascii="Calibri" w:hAnsi="Calibri"/>
+          <w:color w:val="161F2D"/>
+          <w:sz w:val="19"/>
+        </w:rPr>
         <w:t>Design Redshift/SQL data marts, reusable analytics models, Power BI reporting layers, metadata standards, and data-quality checks for consistent self-service reporting.</w:t>
       </w:r>
     </w:p>
@@ -432,7 +460,7 @@
           <w:color w:val="161F2D"/>
           <w:sz w:val="19"/>
         </w:rPr>
-        <w:t>Partner with product managers, engineering, operations, and program stakeholders to define KPIs, validate metric definitions, and align analytics delivery with business and compliance decisions.</w:t>
+        <w:t>Build AWS data workflows using S3, Glue, Lambda, Step Functions, Redshift, SQL, and Python, including transforming Microsoft Teams communications into structured analytics datasets for analysis and reporting.</w:t>
       </w:r>
     </w:p>
     <w:p>
@@ -446,7 +474,7 @@
           <w:color w:val="161F2D"/>
           <w:sz w:val="19"/>
         </w:rPr>
-        <w:t>Build and support AWS data workflows using S3, Glue, Lambda, Step Functions, Redshift, SQL, and Python, including transforming Microsoft Teams communications into structured analytics datasets.</w:t>
+        <w:t>Built a Power Apps and Power Automate workflow that automated manual AD-group reviews with daily monitoring, exception flagging, change-history exports, and notifications, strengthening least-privilege governance.</w:t>
       </w:r>
     </w:p>
     <w:p>
@@ -460,21 +488,7 @@
           <w:color w:val="161F2D"/>
           <w:sz w:val="19"/>
         </w:rPr>
-        <w:t>Implement CloudWatch monitoring, alerting, validation, troubleshooting, and SQL/warehouse tuning to improve visibility and reliability for recurring analytics workflows and dashboards.</w:t>
-      </w:r>
-    </w:p>
-    <w:p>
-      <w:pPr>
-        <w:pStyle w:val="ResumeBullet"/>
-        <w:keepLines/>
-      </w:pPr>
-      <w:r>
-        <w:rPr>
-          <w:rFonts w:ascii="Calibri" w:hAnsi="Calibri"/>
-          <w:color w:val="161F2D"/>
-          <w:sz w:val="19"/>
-        </w:rPr>
-        <w:t>Configure Power Automate notifications and support SQL connectors and retrieval-design discussions for an internal RAG chat using Azure OpenAI and Azure AI Search within enterprise security constraints.</w:t>
+        <w:t>Configure Power Automate notifications and support SQL connectors and retrieval-design discussions for a bounded internal RAG workflow using Azure OpenAI and Azure AI Search, with data, model endpoints, and logic retained inside enterprise security controls.</w:t>
       </w:r>
     </w:p>
     <w:p>
@@ -649,7 +663,7 @@
           <w:color w:val="4E5968"/>
           <w:sz w:val="18"/>
         </w:rPr>
-        <w:t xml:space="preserve"> | Kforce Consulting - employer</w:t>
+        <w:t xml:space="preserve"> | Kforce Consulting</w:t>
       </w:r>
     </w:p>
     <w:p>
@@ -691,7 +705,7 @@
           <w:color w:val="161F2D"/>
           <w:sz w:val="19"/>
         </w:rPr>
-        <w:t>Developed BI dashboards and KPI reporting solutions supporting incident analysis, campaign-performance tracking, and stakeholder decision-making.</w:t>
+        <w:t>Replaced multi-day email and Excel reporting with an automated Tableau system that tracked product-security work from approval through production, highlighted bottlenecks, and delivered threshold alerts for leadership planning.</w:t>
       </w:r>
     </w:p>
     <w:p>
@@ -829,7 +843,7 @@
           <w:color w:val="161F2D"/>
           <w:sz w:val="19"/>
         </w:rPr>
-        <w:t xml:space="preserve"> - Built a Python/OpenAI/Streamlit earnings-intelligence prototype with config-driven document ingestion, structured JSON insight packs, KPI extraction, AI summaries, and document-aware Q&amp;A over a limited set of sample earnings materials.</w:t>
+        <w:t xml:space="preserve"> - Built a Python/OpenAI/Streamlit prototype to help financial analysts move from sample earnings documents to structured KPIs, source-aware summaries, and document Q&amp;A through config-driven ingestion and JSON insight packs.</w:t>
       </w:r>
     </w:p>
     <w:p>
@@ -856,7 +870,7 @@
           <w:color w:val="161F2D"/>
           <w:sz w:val="19"/>
         </w:rPr>
-        <w:t xml:space="preserve"> - Created a media-merger strategy sandbox combining explainable rules, embeddings/FAISS, traceable sources, interactive buyer/target scenarios, IP-similarity views, and clearly labeled exploratory predictions.</w:t>
+        <w:t xml:space="preserve"> - Created a media-merger strategy sandbox to help strategy teams compare buyer/target scenarios using explainable rules, embeddings/FAISS, traceable sources, IP-similarity views, and clearly labeled exploratory predictions.</w:t>
       </w:r>
     </w:p>
     <w:p>
@@ -883,7 +897,7 @@
           <w:color w:val="161F2D"/>
           <w:sz w:val="19"/>
         </w:rPr>
-        <w:t xml:space="preserve"> - Developed a synthetic cross-media planning workflow spanning data generation, linear/XGBoost response modeling, reach-overlap simulation, constrained optimization, and explainability to compare conversion and reach trade-offs.</w:t>
+        <w:t xml:space="preserve"> - Developed a synthetic cross-media planning workflow to help planners compare conversion and reach trade-offs through data generation, linear/XGBoost response modeling, reach-overlap simulation, constrained optimization, and explainability.</w:t>
       </w:r>
     </w:p>
     <w:p>

</xml_diff>

<commit_message>
Strengthen Textent calling card and resume prose
</commit_message>
<xml_diff>
--- a/assets/resume/Aravind_Anisetti_Data_AI_Solutions_Architect.docx
+++ b/assets/resume/Aravind_Anisetti_Data_AI_Solutions_Architect.docx
@@ -169,7 +169,7 @@
           <w:color w:val="161F2D"/>
           <w:sz w:val="19"/>
         </w:rPr>
-        <w:t>Data Analytics Lead with 8+ years of experience translating enterprise requirements into analytics, event-driven AWS data workflows, automation, and applied-AI solutions across federal and commercial environments. AWS Certified Solutions Architect - Associate with experience spanning AWS, Redshift, Snowflake, SQL, Python, Power BI, bounded RAG controls, operational reliability, and cross-functional solution delivery. Creator and Product Architect of Textent, a private GenAI product architecture for evidence-backed review of complex, versioned documents.</w:t>
+        <w:t>Data Analytics Lead with 8+ years of experience building analytics, AWS data workflows, automation, and applied AI solutions across federal and commercial environments. AWS Certified Solutions Architect - Associate with hands-on experience in Redshift, Snowflake, SQL, Python, Power BI, RAG controls, and operational reliability. Creator and Product Architect of Textent, a private GenAI product architecture for evidence-backed review of complex, versioned documents.</w:t>
       </w:r>
     </w:p>
     <w:p>
@@ -281,7 +281,7 @@
           <w:color w:val="161F2D"/>
           <w:sz w:val="19"/>
         </w:rPr>
-        <w:t>Defined Reuse, Compare, and Decide workflows to reduce manual review effort for analysts and business reviewers by turning complex versioned documents into material findings with exact evidence, business consequence, and a human-owned next action.</w:t>
+        <w:t>Created Textent to help teams review long, versioned documents without losing the evidence behind each decision. Defined Reuse, Compare, and Decide workflows that surface material changes, business impact, and the next human action.</w:t>
       </w:r>
     </w:p>
     <w:p>
@@ -295,7 +295,7 @@
           <w:color w:val="161F2D"/>
           <w:sz w:val="19"/>
         </w:rPr>
-        <w:t>Implemented and verified an offline core for DOCX structure validation, main-body extraction, source-bound evidence anchors, admission limits, fail-closed evidence checks, and automated workflow verification.</w:t>
+        <w:t>Implemented and verified an offline core that validates DOCX structure, extracts the main body, and creates source-bound evidence anchors. Added admission limits, fail-closed evidence checks, and automated workflow verification.</w:t>
       </w:r>
     </w:p>
     <w:p>
@@ -309,7 +309,7 @@
           <w:color w:val="161F2D"/>
           <w:sz w:val="19"/>
         </w:rPr>
-        <w:t>Designed an event-driven AWS target architecture using CloudFront, WAF, Cognito, API Gateway, S3, SQS/DLQ, Step Functions, Lambda, DynamoDB, CloudWatch, CDK, and bounded Amazon Bedrock inference, with identity, cost, observability, recovery, retention, and deletion controls.</w:t>
+        <w:t>Designed an event-driven AWS target architecture for asynchronous document processing and bounded Amazon Bedrock inference. The design includes identity, cost, observability, recovery, retention, and deletion controls.</w:t>
       </w:r>
     </w:p>
     <w:p>
@@ -404,7 +404,7 @@
           <w:color w:val="161F2D"/>
           <w:sz w:val="19"/>
         </w:rPr>
-        <w:t>Lead analytics delivery across business and technical stakeholders, translating reporting and operational needs into prioritized data products, reporting solutions, and decision-support workflows.</w:t>
+        <w:t>Lead analytics delivery for business and technical stakeholders. Translate reporting and operational needs into prioritized data products, automation, and decision-support workflows.</w:t>
       </w:r>
     </w:p>
     <w:p>
@@ -418,7 +418,7 @@
           <w:color w:val="161F2D"/>
           <w:sz w:val="19"/>
         </w:rPr>
-        <w:t>Built scalable Power BI monitoring and Power Automate alerts for an expanding mix of streaming and batch ETL workflows, reducing failure detection and triage from 1-3 days to within one hour.</w:t>
+        <w:t>Built Power BI monitoring and Power Automate alerts for a growing mix of streaming and batch ETL workflows. Reduced failure detection and triage from 1-3 days to within one hour.</w:t>
       </w:r>
     </w:p>
     <w:p>
@@ -432,7 +432,7 @@
           <w:color w:val="161F2D"/>
           <w:sz w:val="19"/>
         </w:rPr>
-        <w:t>Reduced a large historical-data ingestion from up to six hours to 30-60 minutes by partitioning source data, staging raw files in S3, and parallelizing StreamSets processing.</w:t>
+        <w:t>Reduced a large historical-data ingestion from up to six hours to 30-60 minutes. Partitioned source data by date, staged raw files in S3, and parallelized StreamSets processing.</w:t>
       </w:r>
     </w:p>
     <w:p>
@@ -460,7 +460,7 @@
           <w:color w:val="161F2D"/>
           <w:sz w:val="19"/>
         </w:rPr>
-        <w:t>Build AWS data workflows using S3, Glue, Lambda, Step Functions, Redshift, SQL, and Python, including transforming Microsoft Teams communications into structured analytics datasets for analysis and reporting.</w:t>
+        <w:t>Build AWS data workflows with S3, Glue, Lambda, Step Functions, Redshift, SQL, and Python. One workflow transforms Microsoft Teams communications into structured datasets for analysis and reporting.</w:t>
       </w:r>
     </w:p>
     <w:p>
@@ -474,7 +474,7 @@
           <w:color w:val="161F2D"/>
           <w:sz w:val="19"/>
         </w:rPr>
-        <w:t>Built a Power Apps and Power Automate workflow that automated manual AD-group reviews with daily monitoring, exception flagging, change-history exports, and notifications, strengthening least-privilege governance.</w:t>
+        <w:t>Built a Power Apps and Power Automate workflow for AD-group reviews. Added daily monitoring, exception flags, change-history exports, and notifications to strengthen least-privilege governance.</w:t>
       </w:r>
     </w:p>
     <w:p>
@@ -488,7 +488,7 @@
           <w:color w:val="161F2D"/>
           <w:sz w:val="19"/>
         </w:rPr>
-        <w:t>Configure Power Automate notifications and support SQL connectors and retrieval-design discussions for a bounded internal RAG workflow using Azure OpenAI and Azure AI Search, with data, model endpoints, and logic retained inside enterprise security controls.</w:t>
+        <w:t>Support a bounded internal RAG capability using Azure OpenAI and Azure AI Search. Configure Power Automate notifications, assist with SQL connectors, and contribute retrieval-design input within enterprise security controls.</w:t>
       </w:r>
     </w:p>
     <w:p>
@@ -552,7 +552,7 @@
           <w:color w:val="161F2D"/>
           <w:sz w:val="19"/>
         </w:rPr>
-        <w:t>Built AWS data and machine-learning workflows for credit-derivatives forecasting using S3, Glue/PySpark, Lambda, Step Functions, Redshift, and SageMaker, supporting data preparation, model training, and analyst-ready outputs.</w:t>
+        <w:t>Built AWS data and machine-learning workflows for credit-derivatives forecasting. Used S3, Glue/PySpark, Lambda, Step Functions, Redshift, and SageMaker for data preparation, model training, and analyst-ready outputs.</w:t>
       </w:r>
     </w:p>
     <w:p>
@@ -705,7 +705,7 @@
           <w:color w:val="161F2D"/>
           <w:sz w:val="19"/>
         </w:rPr>
-        <w:t>Replaced multi-day email and Excel reporting with an automated Tableau system that tracked product-security work from approval through production, highlighted bottlenecks, and delivered threshold alerts for leadership planning.</w:t>
+        <w:t>Replaced multi-day email and Excel reporting with an automated Tableau system. It tracked product-security work from approval through production, highlighted bottlenecks, and delivered threshold alerts for leadership planning.</w:t>
       </w:r>
     </w:p>
     <w:p>
@@ -843,7 +843,7 @@
           <w:color w:val="161F2D"/>
           <w:sz w:val="19"/>
         </w:rPr>
-        <w:t xml:space="preserve"> - Built a Python/OpenAI/Streamlit prototype to help financial analysts move from sample earnings documents to structured KPIs, source-aware summaries, and document Q&amp;A through config-driven ingestion and JSON insight packs.</w:t>
+        <w:t xml:space="preserve"> - Built a Python/OpenAI/Streamlit prototype for earnings analysis. It converts sample documents into structured KPIs, source-aware summaries, and document Q&amp;A.</w:t>
       </w:r>
     </w:p>
     <w:p>
@@ -870,7 +870,7 @@
           <w:color w:val="161F2D"/>
           <w:sz w:val="19"/>
         </w:rPr>
-        <w:t xml:space="preserve"> - Created a media-merger strategy sandbox to help strategy teams compare buyer/target scenarios using explainable rules, embeddings/FAISS, traceable sources, IP-similarity views, and clearly labeled exploratory predictions.</w:t>
+        <w:t xml:space="preserve"> - Created a media-merger strategy sandbox with explainable rules, embeddings/FAISS, traceable sources, and IP-similarity views. It helps teams compare buyer and target scenarios.</w:t>
       </w:r>
     </w:p>
     <w:p>
@@ -897,7 +897,7 @@
           <w:color w:val="161F2D"/>
           <w:sz w:val="19"/>
         </w:rPr>
-        <w:t xml:space="preserve"> - Developed a synthetic cross-media planning workflow to help planners compare conversion and reach trade-offs through data generation, linear/XGBoost response modeling, reach-overlap simulation, constrained optimization, and explainability.</w:t>
+        <w:t xml:space="preserve"> - Developed a synthetic cross-media planning workflow using linear and XGBoost response models, reach-overlap simulation, constrained optimization, and explainability. It compares conversion and reach trade-offs.</w:t>
       </w:r>
     </w:p>
     <w:p>

</xml_diff>

<commit_message>
Redesign portfolio and Textent case study
</commit_message>
<xml_diff>
--- a/assets/resume/Aravind_Anisetti_Data_AI_Solutions_Architect.docx
+++ b/assets/resume/Aravind_Anisetti_Data_AI_Solutions_Architect.docx
@@ -169,7 +169,7 @@
           <w:color w:val="161F2D"/>
           <w:sz w:val="19"/>
         </w:rPr>
-        <w:t>Data Analytics Lead with 8+ years of experience building analytics, AWS data workflows, automation, and applied AI solutions across federal and commercial environments. AWS Certified Solutions Architect - Associate with hands-on experience in Redshift, Snowflake, SQL, Python, Power BI, RAG controls, and operational reliability. Creator and Product Architect of Textent, a private GenAI product architecture for evidence-backed review of complex, versioned documents.</w:t>
+        <w:t>Data Analytics Lead and AWS Certified Solutions Architect with 8+ years of experience delivering analytics, cloud data, automation, and applied AI solutions across federal and commercial environments. Hands-on with AWS, Azure OpenAI, Azure AI Search, RAG, SQL, Python, Power BI, and operational reliability. Creator and Product Architect of Textent, a private GenAI document-intelligence product for evidence-backed, audit-traceable review of complex, versioned documents.</w:t>
       </w:r>
     </w:p>
     <w:p>
@@ -183,7 +183,7 @@
           <w:color w:val="161F2D"/>
           <w:sz w:val="19"/>
         </w:rPr>
-        <w:t>SIGNATURE AI PRODUCT</w:t>
+        <w:t>INDEPENDENT GENAI PRODUCT</w:t>
       </w:r>
     </w:p>
     <w:p>
@@ -218,7 +218,7 @@
           <w:color w:val="4E5968"/>
           <w:sz w:val="18"/>
         </w:rPr>
-        <w:t>Active development</w:t>
+        <w:t>Private</w:t>
       </w:r>
     </w:p>
     <w:p>
@@ -233,16 +233,7 @@
           <w:color w:val="2A527A"/>
           <w:sz w:val="19"/>
         </w:rPr>
-        <w:t>Private GenAI Document Intelligence Product</w:t>
-      </w:r>
-      <w:r>
-        <w:rPr>
-          <w:rFonts w:ascii="Calibri" w:hAnsi="Calibri"/>
-          <w:i/>
-          <w:color w:val="4E5968"/>
-          <w:sz w:val="18"/>
-        </w:rPr>
-        <w:t xml:space="preserve"> | Private, pre-launch | Verified offline core | AWS target architecture</w:t>
+        <w:t>GenAI Document Intelligence Product</w:t>
       </w:r>
     </w:p>
     <w:p>
@@ -281,7 +272,7 @@
           <w:color w:val="161F2D"/>
           <w:sz w:val="19"/>
         </w:rPr>
-        <w:t>Created Textent to help teams review long, versioned documents without losing the evidence behind each decision. Defined Reuse, Compare, and Decide workflows that surface material changes, business impact, and the next human action.</w:t>
+        <w:t>Created Textent to help teams review long, versioned documents without losing the evidence behind each decision. Designed Reuse, Compare, and Decide workflows that surface material changes, shifts in intent, business impact, and the next human review action.</w:t>
       </w:r>
     </w:p>
     <w:p>
@@ -295,7 +286,7 @@
           <w:color w:val="161F2D"/>
           <w:sz w:val="19"/>
         </w:rPr>
-        <w:t>Implemented and verified an offline core that validates DOCX structure, extracts the main body, and creates source-bound evidence anchors. Added admission limits, fail-closed evidence checks, and automated workflow verification.</w:t>
+        <w:t>Built and tested an agentic document-intelligence workflow using LangChain, LangGraph, FAISS, and Amazon Bedrock. The system aligns related sections across document versions, identifies changes in intent, obligations, assumptions, and decision impact, validates every finding against paired source evidence, and routes uncertain or consequential findings for human approval.</w:t>
       </w:r>
     </w:p>
     <w:p>
@@ -309,7 +300,7 @@
           <w:color w:val="161F2D"/>
           <w:sz w:val="19"/>
         </w:rPr>
-        <w:t>Designed an event-driven AWS target architecture for asynchronous document processing and bounded Amazon Bedrock inference. The design includes identity, cost, observability, recovery, retention, and deletion controls.</w:t>
+        <w:t>Built and tested an earlier serverless review pipeline with AWS Lambda, S3, SQS, and Amazon Bedrock. Added structured outputs, source-linked evidence, IAM-scoped execution, immutable snapshots, lineage, bounded model behavior, and human review controls.</w:t>
       </w:r>
     </w:p>
     <w:p>
@@ -779,7 +770,7 @@
           <w:color w:val="161F2D"/>
           <w:sz w:val="19"/>
         </w:rPr>
-        <w:t>Generative AI, RAG design, structure-aware chunking, embeddings/vector retrieval, hybrid search and reranking, structured outputs, LLM evaluation, human-in-the-loop controls, Azure OpenAI, Azure AI Search, Amazon Bedrock architecture, Power BI, Tableau, SageMaker, and Power Automate</w:t>
+        <w:t>Generative AI, RAG design, agentic workflow design, LangChain, LangGraph, structure-aware chunking, embeddings/vector retrieval (FAISS), hybrid search and reranking, structured outputs, LLM evaluation, human-in-the-loop controls, Azure OpenAI, Azure AI Search, Amazon Bedrock, Power BI, Tableau, SageMaker, and Power Automate</w:t>
       </w:r>
     </w:p>
     <w:p>

</xml_diff>

<commit_message>
Refine portfolio narrative and Textent case study (#5)
* Refine portfolio privacy and writing

* Strengthen Textent calling card and resume prose

* Refine Textent product case study

* Redesign portfolio and Textent case study

---------

Co-authored-by: Aravind Anisetti <anisetti.ar@example.com>
</commit_message>
<xml_diff>
--- a/assets/resume/Aravind_Anisetti_Data_AI_Solutions_Architect.docx
+++ b/assets/resume/Aravind_Anisetti_Data_AI_Solutions_Architect.docx
@@ -169,7 +169,7 @@
           <w:color w:val="161F2D"/>
           <w:sz w:val="19"/>
         </w:rPr>
-        <w:t>Data Analytics Lead with 8+ years of experience translating enterprise requirements into analytics, event-driven AWS data workflows, automation, and applied-AI solutions across federal and commercial environments. AWS Certified Solutions Architect - Associate with experience spanning AWS, Redshift, Snowflake, SQL, Python, Power BI, bounded RAG controls, operational reliability, and cross-functional solution delivery. Creator and Product Architect of Textent, a private GenAI product architecture for evidence-backed review of complex, versioned documents.</w:t>
+        <w:t>Data Analytics Lead and AWS Certified Solutions Architect with 8+ years of experience delivering analytics, cloud data, automation, and applied AI solutions across federal and commercial environments. Hands-on with AWS, Azure OpenAI, Azure AI Search, RAG, SQL, Python, Power BI, and operational reliability. Creator and Product Architect of Textent, a private GenAI document-intelligence product for evidence-backed, audit-traceable review of complex, versioned documents.</w:t>
       </w:r>
     </w:p>
     <w:p>
@@ -183,7 +183,7 @@
           <w:color w:val="161F2D"/>
           <w:sz w:val="19"/>
         </w:rPr>
-        <w:t>SIGNATURE AI PRODUCT</w:t>
+        <w:t>INDEPENDENT GENAI PRODUCT</w:t>
       </w:r>
     </w:p>
     <w:p>
@@ -218,7 +218,7 @@
           <w:color w:val="4E5968"/>
           <w:sz w:val="18"/>
         </w:rPr>
-        <w:t>Active development</w:t>
+        <w:t>Private</w:t>
       </w:r>
     </w:p>
     <w:p>
@@ -233,16 +233,7 @@
           <w:color w:val="2A527A"/>
           <w:sz w:val="19"/>
         </w:rPr>
-        <w:t>Private GenAI Document Intelligence Product</w:t>
-      </w:r>
-      <w:r>
-        <w:rPr>
-          <w:rFonts w:ascii="Calibri" w:hAnsi="Calibri"/>
-          <w:i/>
-          <w:color w:val="4E5968"/>
-          <w:sz w:val="18"/>
-        </w:rPr>
-        <w:t xml:space="preserve"> | Private, pre-launch | Verified offline core | AWS target architecture</w:t>
+        <w:t>GenAI Document Intelligence Product</w:t>
       </w:r>
     </w:p>
     <w:p>
@@ -281,7 +272,7 @@
           <w:color w:val="161F2D"/>
           <w:sz w:val="19"/>
         </w:rPr>
-        <w:t>Defined Reuse, Compare, and Decide workflows to reduce manual review effort for analysts and business reviewers by turning complex versioned documents into material findings with exact evidence, business consequence, and a human-owned next action.</w:t>
+        <w:t>Created Textent to help teams review long, versioned documents without losing the evidence behind each decision. Designed Reuse, Compare, and Decide workflows that surface material changes, shifts in intent, business impact, and the next human review action.</w:t>
       </w:r>
     </w:p>
     <w:p>
@@ -295,7 +286,7 @@
           <w:color w:val="161F2D"/>
           <w:sz w:val="19"/>
         </w:rPr>
-        <w:t>Implemented and verified an offline core for DOCX structure validation, main-body extraction, source-bound evidence anchors, admission limits, fail-closed evidence checks, and automated workflow verification.</w:t>
+        <w:t>Built and tested an agentic document-intelligence workflow using LangChain, LangGraph, FAISS, and Amazon Bedrock. The system aligns related sections across document versions, identifies changes in intent, obligations, assumptions, and decision impact, validates every finding against paired source evidence, and routes uncertain or consequential findings for human approval.</w:t>
       </w:r>
     </w:p>
     <w:p>
@@ -309,7 +300,7 @@
           <w:color w:val="161F2D"/>
           <w:sz w:val="19"/>
         </w:rPr>
-        <w:t>Designed an event-driven AWS target architecture using CloudFront, WAF, Cognito, API Gateway, S3, SQS/DLQ, Step Functions, Lambda, DynamoDB, CloudWatch, CDK, and bounded Amazon Bedrock inference, with identity, cost, observability, recovery, retention, and deletion controls.</w:t>
+        <w:t>Built and tested an earlier serverless review pipeline with AWS Lambda, S3, SQS, and Amazon Bedrock. Added structured outputs, source-linked evidence, IAM-scoped execution, immutable snapshots, lineage, bounded model behavior, and human review controls.</w:t>
       </w:r>
     </w:p>
     <w:p>
@@ -404,7 +395,7 @@
           <w:color w:val="161F2D"/>
           <w:sz w:val="19"/>
         </w:rPr>
-        <w:t>Lead analytics delivery across business and technical stakeholders, translating reporting and operational needs into prioritized data products, reporting solutions, and decision-support workflows.</w:t>
+        <w:t>Lead analytics delivery for business and technical stakeholders. Translate reporting and operational needs into prioritized data products, automation, and decision-support workflows.</w:t>
       </w:r>
     </w:p>
     <w:p>
@@ -418,7 +409,7 @@
           <w:color w:val="161F2D"/>
           <w:sz w:val="19"/>
         </w:rPr>
-        <w:t>Built scalable Power BI monitoring and Power Automate alerts for an expanding mix of streaming and batch ETL workflows, reducing failure detection and triage from 1-3 days to within one hour.</w:t>
+        <w:t>Built Power BI monitoring and Power Automate alerts for a growing mix of streaming and batch ETL workflows. Reduced failure detection and triage from 1-3 days to within one hour.</w:t>
       </w:r>
     </w:p>
     <w:p>
@@ -432,7 +423,7 @@
           <w:color w:val="161F2D"/>
           <w:sz w:val="19"/>
         </w:rPr>
-        <w:t>Reduced a large historical-data ingestion from up to six hours to 30-60 minutes by partitioning source data, staging raw files in S3, and parallelizing StreamSets processing.</w:t>
+        <w:t>Reduced a large historical-data ingestion from up to six hours to 30-60 minutes. Partitioned source data by date, staged raw files in S3, and parallelized StreamSets processing.</w:t>
       </w:r>
     </w:p>
     <w:p>
@@ -460,7 +451,7 @@
           <w:color w:val="161F2D"/>
           <w:sz w:val="19"/>
         </w:rPr>
-        <w:t>Build AWS data workflows using S3, Glue, Lambda, Step Functions, Redshift, SQL, and Python, including transforming Microsoft Teams communications into structured analytics datasets for analysis and reporting.</w:t>
+        <w:t>Build AWS data workflows with S3, Glue, Lambda, Step Functions, Redshift, SQL, and Python. One workflow transforms Microsoft Teams communications into structured datasets for analysis and reporting.</w:t>
       </w:r>
     </w:p>
     <w:p>
@@ -474,7 +465,7 @@
           <w:color w:val="161F2D"/>
           <w:sz w:val="19"/>
         </w:rPr>
-        <w:t>Built a Power Apps and Power Automate workflow that automated manual AD-group reviews with daily monitoring, exception flagging, change-history exports, and notifications, strengthening least-privilege governance.</w:t>
+        <w:t>Built a Power Apps and Power Automate workflow for AD-group reviews. Added daily monitoring, exception flags, change-history exports, and notifications to strengthen least-privilege governance.</w:t>
       </w:r>
     </w:p>
     <w:p>
@@ -488,7 +479,7 @@
           <w:color w:val="161F2D"/>
           <w:sz w:val="19"/>
         </w:rPr>
-        <w:t>Configure Power Automate notifications and support SQL connectors and retrieval-design discussions for a bounded internal RAG workflow using Azure OpenAI and Azure AI Search, with data, model endpoints, and logic retained inside enterprise security controls.</w:t>
+        <w:t>Support a bounded internal RAG capability using Azure OpenAI and Azure AI Search. Configure Power Automate notifications, assist with SQL connectors, and contribute retrieval-design input within enterprise security controls.</w:t>
       </w:r>
     </w:p>
     <w:p>
@@ -552,7 +543,7 @@
           <w:color w:val="161F2D"/>
           <w:sz w:val="19"/>
         </w:rPr>
-        <w:t>Built AWS data and machine-learning workflows for credit-derivatives forecasting using S3, Glue/PySpark, Lambda, Step Functions, Redshift, and SageMaker, supporting data preparation, model training, and analyst-ready outputs.</w:t>
+        <w:t>Built AWS data and machine-learning workflows for credit-derivatives forecasting. Used S3, Glue/PySpark, Lambda, Step Functions, Redshift, and SageMaker for data preparation, model training, and analyst-ready outputs.</w:t>
       </w:r>
     </w:p>
     <w:p>
@@ -705,7 +696,7 @@
           <w:color w:val="161F2D"/>
           <w:sz w:val="19"/>
         </w:rPr>
-        <w:t>Replaced multi-day email and Excel reporting with an automated Tableau system that tracked product-security work from approval through production, highlighted bottlenecks, and delivered threshold alerts for leadership planning.</w:t>
+        <w:t>Replaced multi-day email and Excel reporting with an automated Tableau system. It tracked product-security work from approval through production, highlighted bottlenecks, and delivered threshold alerts for leadership planning.</w:t>
       </w:r>
     </w:p>
     <w:p>
@@ -779,7 +770,7 @@
           <w:color w:val="161F2D"/>
           <w:sz w:val="19"/>
         </w:rPr>
-        <w:t>Generative AI, RAG design, structure-aware chunking, embeddings/vector retrieval, hybrid search and reranking, structured outputs, LLM evaluation, human-in-the-loop controls, Azure OpenAI, Azure AI Search, Amazon Bedrock architecture, Power BI, Tableau, SageMaker, and Power Automate</w:t>
+        <w:t>Generative AI, RAG design, agentic workflow design, LangChain, LangGraph, structure-aware chunking, embeddings/vector retrieval (FAISS), hybrid search and reranking, structured outputs, LLM evaluation, human-in-the-loop controls, Azure OpenAI, Azure AI Search, Amazon Bedrock, Power BI, Tableau, SageMaker, and Power Automate</w:t>
       </w:r>
     </w:p>
     <w:p>
@@ -843,7 +834,7 @@
           <w:color w:val="161F2D"/>
           <w:sz w:val="19"/>
         </w:rPr>
-        <w:t xml:space="preserve"> - Built a Python/OpenAI/Streamlit prototype to help financial analysts move from sample earnings documents to structured KPIs, source-aware summaries, and document Q&amp;A through config-driven ingestion and JSON insight packs.</w:t>
+        <w:t xml:space="preserve"> - Built a Python/OpenAI/Streamlit prototype for earnings analysis. It converts sample documents into structured KPIs, source-aware summaries, and document Q&amp;A.</w:t>
       </w:r>
     </w:p>
     <w:p>
@@ -870,7 +861,7 @@
           <w:color w:val="161F2D"/>
           <w:sz w:val="19"/>
         </w:rPr>
-        <w:t xml:space="preserve"> - Created a media-merger strategy sandbox to help strategy teams compare buyer/target scenarios using explainable rules, embeddings/FAISS, traceable sources, IP-similarity views, and clearly labeled exploratory predictions.</w:t>
+        <w:t xml:space="preserve"> - Created a media-merger strategy sandbox with explainable rules, embeddings/FAISS, traceable sources, and IP-similarity views. It helps teams compare buyer and target scenarios.</w:t>
       </w:r>
     </w:p>
     <w:p>
@@ -897,7 +888,7 @@
           <w:color w:val="161F2D"/>
           <w:sz w:val="19"/>
         </w:rPr>
-        <w:t xml:space="preserve"> - Developed a synthetic cross-media planning workflow to help planners compare conversion and reach trade-offs through data generation, linear/XGBoost response modeling, reach-overlap simulation, constrained optimization, and explainability.</w:t>
+        <w:t xml:space="preserve"> - Developed a synthetic cross-media planning workflow using linear and XGBoost response models, reach-overlap simulation, constrained optimization, and explainability. It compares conversion and reach trade-offs.</w:t>
       </w:r>
     </w:p>
     <w:p>

</xml_diff>